<commit_message>
Double first name initial support, fix bugs
</commit_message>
<xml_diff>
--- a/src/ReaderApp/data/2024_sem2/19.03.25/Orar_An_I Lic.docx
+++ b/src/ReaderApp/data/2024_sem2/19.03.25/Orar_An_I Lic.docx
@@ -115,7 +115,23 @@
                 <w:b/>
                 <w:sz w:val="40"/>
               </w:rPr>
-              <w:t>01(ro)</w:t>
+              <w:t>01(</w:t>
+            </w:r>
+            <w:proofErr w:type="spellStart"/>
+            <w:r>
+              <w:rPr>
+                <w:b/>
+                <w:sz w:val="40"/>
+              </w:rPr>
+              <w:t>ro</w:t>
+            </w:r>
+            <w:proofErr w:type="spellEnd"/>
+            <w:r>
+              <w:rPr>
+                <w:b/>
+                <w:sz w:val="40"/>
+              </w:rPr>
+              <w:t>)</w:t>
             </w:r>
           </w:p>
         </w:tc>
@@ -158,7 +174,23 @@
                 <w:b/>
                 <w:sz w:val="40"/>
               </w:rPr>
-              <w:t>01(ro)</w:t>
+              <w:t>01(</w:t>
+            </w:r>
+            <w:proofErr w:type="spellStart"/>
+            <w:r>
+              <w:rPr>
+                <w:b/>
+                <w:sz w:val="40"/>
+              </w:rPr>
+              <w:t>ro</w:t>
+            </w:r>
+            <w:proofErr w:type="spellEnd"/>
+            <w:r>
+              <w:rPr>
+                <w:b/>
+                <w:sz w:val="40"/>
+              </w:rPr>
+              <w:t>)</w:t>
             </w:r>
           </w:p>
         </w:tc>
@@ -201,7 +233,23 @@
                 <w:b/>
                 <w:sz w:val="40"/>
               </w:rPr>
-              <w:t>01(ro)</w:t>
+              <w:t>01(</w:t>
+            </w:r>
+            <w:proofErr w:type="spellStart"/>
+            <w:r>
+              <w:rPr>
+                <w:b/>
+                <w:sz w:val="40"/>
+              </w:rPr>
+              <w:t>ro</w:t>
+            </w:r>
+            <w:proofErr w:type="spellEnd"/>
+            <w:r>
+              <w:rPr>
+                <w:b/>
+                <w:sz w:val="40"/>
+              </w:rPr>
+              <w:t>)</w:t>
             </w:r>
           </w:p>
         </w:tc>
@@ -244,7 +292,23 @@
                 <w:b/>
                 <w:sz w:val="40"/>
               </w:rPr>
-              <w:t>02(ro)</w:t>
+              <w:t>02(</w:t>
+            </w:r>
+            <w:proofErr w:type="spellStart"/>
+            <w:r>
+              <w:rPr>
+                <w:b/>
+                <w:sz w:val="40"/>
+              </w:rPr>
+              <w:t>ro</w:t>
+            </w:r>
+            <w:proofErr w:type="spellEnd"/>
+            <w:r>
+              <w:rPr>
+                <w:b/>
+                <w:sz w:val="40"/>
+              </w:rPr>
+              <w:t>)</w:t>
             </w:r>
           </w:p>
         </w:tc>
@@ -276,6 +340,7 @@
                 <w:lang w:val="ro-RO"/>
               </w:rPr>
             </w:pPr>
+            <w:proofErr w:type="spellStart"/>
             <w:r>
               <w:rPr>
                 <w:b/>
@@ -283,6 +348,7 @@
               </w:rPr>
               <w:t>Luni</w:t>
             </w:r>
+            <w:proofErr w:type="spellEnd"/>
           </w:p>
         </w:tc>
         <w:tc>
@@ -2148,6 +2214,7 @@
                 <w:sz w:val="40"/>
               </w:rPr>
             </w:pPr>
+            <w:proofErr w:type="spellStart"/>
             <w:r>
               <w:rPr>
                 <w:b/>
@@ -2155,6 +2222,7 @@
               </w:rPr>
               <w:t>Marţi</w:t>
             </w:r>
+            <w:proofErr w:type="spellEnd"/>
           </w:p>
         </w:tc>
         <w:tc>
@@ -3260,6 +3328,7 @@
                 <w:sz w:val="40"/>
               </w:rPr>
             </w:pPr>
+            <w:proofErr w:type="spellStart"/>
             <w:r>
               <w:rPr>
                 <w:b/>
@@ -3267,6 +3336,7 @@
               </w:rPr>
               <w:t>Miercuri</w:t>
             </w:r>
+            <w:proofErr w:type="spellEnd"/>
           </w:p>
         </w:tc>
         <w:tc>
@@ -3699,12 +3769,23 @@
                 <w:lang w:val="it-IT"/>
               </w:rPr>
             </w:pPr>
-            <w:r>
-              <w:rPr>
-                <w:sz w:val="28"/>
-                <w:szCs w:val="28"/>
-              </w:rPr>
-              <w:t>A.Lupușor  401/4</w:t>
+            <w:proofErr w:type="spellStart"/>
+            <w:proofErr w:type="gramStart"/>
+            <w:r>
+              <w:rPr>
+                <w:sz w:val="28"/>
+                <w:szCs w:val="28"/>
+              </w:rPr>
+              <w:t>A.Lupușor</w:t>
+            </w:r>
+            <w:proofErr w:type="spellEnd"/>
+            <w:proofErr w:type="gramEnd"/>
+            <w:r>
+              <w:rPr>
+                <w:sz w:val="28"/>
+                <w:szCs w:val="28"/>
+              </w:rPr>
+              <w:t xml:space="preserve">  401/4</w:t>
             </w:r>
           </w:p>
         </w:tc>
@@ -4078,6 +4159,7 @@
                 <w:szCs w:val="32"/>
               </w:rPr>
             </w:pPr>
+            <w:proofErr w:type="spellStart"/>
             <w:r>
               <w:rPr>
                 <w:spacing w:val="40"/>
@@ -4086,6 +4168,7 @@
               </w:rPr>
               <w:t>Rețele</w:t>
             </w:r>
+            <w:proofErr w:type="spellEnd"/>
             <w:r>
               <w:rPr>
                 <w:spacing w:val="40"/>
@@ -4110,31 +4193,53 @@
               </w:rPr>
               <w:t xml:space="preserve"> </w:t>
             </w:r>
+            <w:proofErr w:type="spellStart"/>
             <w:r>
               <w:rPr>
                 <w:spacing w:val="40"/>
                 <w:sz w:val="32"/>
                 <w:szCs w:val="32"/>
               </w:rPr>
-              <w:t>calculatoare (curs)</w:t>
-            </w:r>
-          </w:p>
-          <w:p>
-            <w:pPr>
-              <w:jc w:val="center"/>
+              <w:t>calculatoare</w:t>
+            </w:r>
+            <w:proofErr w:type="spellEnd"/>
+            <w:r>
               <w:rPr>
                 <w:spacing w:val="40"/>
                 <w:sz w:val="32"/>
                 <w:szCs w:val="32"/>
               </w:rPr>
-            </w:pPr>
-            <w:r>
+              <w:t xml:space="preserve"> (curs)</w:t>
+            </w:r>
+          </w:p>
+          <w:p>
+            <w:pPr>
+              <w:jc w:val="center"/>
               <w:rPr>
                 <w:spacing w:val="40"/>
                 <w:sz w:val="32"/>
                 <w:szCs w:val="32"/>
               </w:rPr>
-              <w:t>T.Capcelea  213a/4</w:t>
+            </w:pPr>
+            <w:proofErr w:type="spellStart"/>
+            <w:proofErr w:type="gramStart"/>
+            <w:r>
+              <w:rPr>
+                <w:spacing w:val="40"/>
+                <w:sz w:val="32"/>
+                <w:szCs w:val="32"/>
+              </w:rPr>
+              <w:t>T.Capcelea</w:t>
+            </w:r>
+            <w:proofErr w:type="spellEnd"/>
+            <w:proofErr w:type="gramEnd"/>
+            <w:r>
+              <w:rPr>
+                <w:spacing w:val="40"/>
+                <w:sz w:val="32"/>
+                <w:szCs w:val="32"/>
+              </w:rPr>
+              <w:t xml:space="preserve">  213a/4</w:t>
             </w:r>
           </w:p>
         </w:tc>
@@ -5172,15 +5277,32 @@
                 <w:sz w:val="24"/>
                 <w:szCs w:val="24"/>
               </w:rPr>
-              <w:t xml:space="preserve"> O</w:t>
-            </w:r>
-            <w:r>
-              <w:rPr>
-                <w:sz w:val="24"/>
-                <w:szCs w:val="24"/>
-                <w:lang w:val="it-IT"/>
-              </w:rPr>
-              <w:t>pț.psihol.(sem)</w:t>
+              <w:t xml:space="preserve"> </w:t>
+            </w:r>
+            <w:proofErr w:type="gramStart"/>
+            <w:r>
+              <w:rPr>
+                <w:sz w:val="24"/>
+                <w:szCs w:val="24"/>
+              </w:rPr>
+              <w:t>O</w:t>
+            </w:r>
+            <w:r>
+              <w:rPr>
+                <w:sz w:val="24"/>
+                <w:szCs w:val="24"/>
+                <w:lang w:val="it-IT"/>
+              </w:rPr>
+              <w:t>pț.psihol.(</w:t>
+            </w:r>
+            <w:proofErr w:type="gramEnd"/>
+            <w:r>
+              <w:rPr>
+                <w:sz w:val="24"/>
+                <w:szCs w:val="24"/>
+                <w:lang w:val="it-IT"/>
+              </w:rPr>
+              <w:t>sem)</w:t>
             </w:r>
           </w:p>
           <w:p>
@@ -5236,15 +5358,32 @@
                 <w:sz w:val="24"/>
                 <w:szCs w:val="24"/>
               </w:rPr>
-              <w:t xml:space="preserve"> O</w:t>
-            </w:r>
-            <w:r>
-              <w:rPr>
-                <w:sz w:val="24"/>
-                <w:szCs w:val="24"/>
-                <w:lang w:val="it-IT"/>
-              </w:rPr>
-              <w:t>pț.psihol.(sem)</w:t>
+              <w:t xml:space="preserve"> </w:t>
+            </w:r>
+            <w:proofErr w:type="gramStart"/>
+            <w:r>
+              <w:rPr>
+                <w:sz w:val="24"/>
+                <w:szCs w:val="24"/>
+              </w:rPr>
+              <w:t>O</w:t>
+            </w:r>
+            <w:r>
+              <w:rPr>
+                <w:sz w:val="24"/>
+                <w:szCs w:val="24"/>
+                <w:lang w:val="it-IT"/>
+              </w:rPr>
+              <w:t>pț.psihol.(</w:t>
+            </w:r>
+            <w:proofErr w:type="gramEnd"/>
+            <w:r>
+              <w:rPr>
+                <w:sz w:val="24"/>
+                <w:szCs w:val="24"/>
+                <w:lang w:val="it-IT"/>
+              </w:rPr>
+              <w:t>sem)</w:t>
             </w:r>
           </w:p>
           <w:p>
@@ -5620,12 +5759,23 @@
                 <w:szCs w:val="28"/>
               </w:rPr>
             </w:pPr>
-            <w:r>
-              <w:rPr>
-                <w:sz w:val="28"/>
-                <w:szCs w:val="28"/>
-              </w:rPr>
-              <w:t>P.Sârbu  419/4</w:t>
+            <w:proofErr w:type="spellStart"/>
+            <w:proofErr w:type="gramStart"/>
+            <w:r>
+              <w:rPr>
+                <w:sz w:val="28"/>
+                <w:szCs w:val="28"/>
+              </w:rPr>
+              <w:t>P.Sârbu</w:t>
+            </w:r>
+            <w:proofErr w:type="spellEnd"/>
+            <w:proofErr w:type="gramEnd"/>
+            <w:r>
+              <w:rPr>
+                <w:sz w:val="28"/>
+                <w:szCs w:val="28"/>
+              </w:rPr>
+              <w:t xml:space="preserve">  419/4</w:t>
             </w:r>
           </w:p>
         </w:tc>
@@ -5968,7 +6118,23 @@
                 <w:sz w:val="28"/>
                 <w:szCs w:val="28"/>
               </w:rPr>
-              <w:t>Struct. alg. (sem)</w:t>
+              <w:t>Struct. alg. (</w:t>
+            </w:r>
+            <w:proofErr w:type="spellStart"/>
+            <w:r>
+              <w:rPr>
+                <w:sz w:val="28"/>
+                <w:szCs w:val="28"/>
+              </w:rPr>
+              <w:t>sem</w:t>
+            </w:r>
+            <w:proofErr w:type="spellEnd"/>
+            <w:r>
+              <w:rPr>
+                <w:sz w:val="28"/>
+                <w:szCs w:val="28"/>
+              </w:rPr>
+              <w:t>)</w:t>
             </w:r>
           </w:p>
           <w:p>
@@ -5980,12 +6146,23 @@
                 <w:szCs w:val="28"/>
               </w:rPr>
             </w:pPr>
-            <w:r>
-              <w:rPr>
-                <w:sz w:val="28"/>
-                <w:szCs w:val="28"/>
-              </w:rPr>
-              <w:t>P.Sârbu  419/4</w:t>
+            <w:proofErr w:type="spellStart"/>
+            <w:proofErr w:type="gramStart"/>
+            <w:r>
+              <w:rPr>
+                <w:sz w:val="28"/>
+                <w:szCs w:val="28"/>
+              </w:rPr>
+              <w:t>P.Sârbu</w:t>
+            </w:r>
+            <w:proofErr w:type="spellEnd"/>
+            <w:proofErr w:type="gramEnd"/>
+            <w:r>
+              <w:rPr>
+                <w:sz w:val="28"/>
+                <w:szCs w:val="28"/>
+              </w:rPr>
+              <w:t xml:space="preserve">  419/4</w:t>
             </w:r>
           </w:p>
         </w:tc>
@@ -6536,6 +6713,7 @@
                 <w:sz w:val="40"/>
               </w:rPr>
             </w:pPr>
+            <w:proofErr w:type="spellStart"/>
             <w:r>
               <w:rPr>
                 <w:b/>
@@ -6543,6 +6721,7 @@
               </w:rPr>
               <w:t>Vineri</w:t>
             </w:r>
+            <w:proofErr w:type="spellEnd"/>
           </w:p>
         </w:tc>
         <w:tc>
@@ -8009,7 +8188,16 @@
                 <w:sz w:val="24"/>
                 <w:szCs w:val="24"/>
               </w:rPr>
-              <w:t>Struct. alg. (curs,</w:t>
+              <w:t>Struct. alg. (</w:t>
+            </w:r>
+            <w:proofErr w:type="spellStart"/>
+            <w:proofErr w:type="gramStart"/>
+            <w:r>
+              <w:rPr>
+                <w:sz w:val="24"/>
+                <w:szCs w:val="24"/>
+              </w:rPr>
+              <w:t>curs,</w:t>
             </w:r>
             <w:r>
               <w:rPr>
@@ -8019,6 +8207,8 @@
               </w:rPr>
               <w:t>par</w:t>
             </w:r>
+            <w:proofErr w:type="spellEnd"/>
+            <w:proofErr w:type="gramEnd"/>
             <w:r>
               <w:rPr>
                 <w:sz w:val="24"/>
@@ -8037,12 +8227,23 @@
                 <w:szCs w:val="24"/>
               </w:rPr>
             </w:pPr>
-            <w:r>
-              <w:rPr>
-                <w:sz w:val="24"/>
-                <w:szCs w:val="24"/>
-              </w:rPr>
-              <w:t>P.Sârbu 419/4</w:t>
+            <w:proofErr w:type="spellStart"/>
+            <w:proofErr w:type="gramStart"/>
+            <w:r>
+              <w:rPr>
+                <w:sz w:val="24"/>
+                <w:szCs w:val="24"/>
+              </w:rPr>
+              <w:t>P.Sârbu</w:t>
+            </w:r>
+            <w:proofErr w:type="spellEnd"/>
+            <w:proofErr w:type="gramEnd"/>
+            <w:r>
+              <w:rPr>
+                <w:sz w:val="24"/>
+                <w:szCs w:val="24"/>
+              </w:rPr>
+              <w:t xml:space="preserve"> 419/4</w:t>
             </w:r>
           </w:p>
         </w:tc>
@@ -8098,6 +8299,7 @@
                 <w:sz w:val="40"/>
               </w:rPr>
             </w:pPr>
+            <w:proofErr w:type="spellStart"/>
             <w:r>
               <w:rPr>
                 <w:b/>
@@ -8105,6 +8307,7 @@
               </w:rPr>
               <w:t>Sâmbătă</w:t>
             </w:r>
+            <w:proofErr w:type="spellEnd"/>
           </w:p>
         </w:tc>
         <w:tc>
@@ -8794,7 +8997,23 @@
                 <w:b/>
                 <w:sz w:val="40"/>
               </w:rPr>
-              <w:t>I2402(ru)</w:t>
+              <w:t>I2402(</w:t>
+            </w:r>
+            <w:proofErr w:type="spellStart"/>
+            <w:r>
+              <w:rPr>
+                <w:b/>
+                <w:sz w:val="40"/>
+              </w:rPr>
+              <w:t>ru</w:t>
+            </w:r>
+            <w:proofErr w:type="spellEnd"/>
+            <w:r>
+              <w:rPr>
+                <w:b/>
+                <w:sz w:val="40"/>
+              </w:rPr>
+              <w:t>)</w:t>
             </w:r>
           </w:p>
         </w:tc>
@@ -8823,7 +9042,23 @@
                 <w:b/>
                 <w:sz w:val="40"/>
               </w:rPr>
-              <w:t>IA2403(ru)</w:t>
+              <w:t>IA2403(</w:t>
+            </w:r>
+            <w:proofErr w:type="spellStart"/>
+            <w:r>
+              <w:rPr>
+                <w:b/>
+                <w:sz w:val="40"/>
+              </w:rPr>
+              <w:t>ru</w:t>
+            </w:r>
+            <w:proofErr w:type="spellEnd"/>
+            <w:r>
+              <w:rPr>
+                <w:b/>
+                <w:sz w:val="40"/>
+              </w:rPr>
+              <w:t>)</w:t>
             </w:r>
           </w:p>
         </w:tc>
@@ -8852,7 +9087,23 @@
                 <w:b/>
                 <w:sz w:val="40"/>
               </w:rPr>
-              <w:t>IA2404(ru)</w:t>
+              <w:t>IA2404(</w:t>
+            </w:r>
+            <w:proofErr w:type="spellStart"/>
+            <w:r>
+              <w:rPr>
+                <w:b/>
+                <w:sz w:val="40"/>
+              </w:rPr>
+              <w:t>ru</w:t>
+            </w:r>
+            <w:proofErr w:type="spellEnd"/>
+            <w:r>
+              <w:rPr>
+                <w:b/>
+                <w:sz w:val="40"/>
+              </w:rPr>
+              <w:t>)</w:t>
             </w:r>
           </w:p>
         </w:tc>
@@ -8896,7 +9147,23 @@
                 <w:b/>
                 <w:sz w:val="40"/>
               </w:rPr>
-              <w:t>01(ro)</w:t>
+              <w:t>01(</w:t>
+            </w:r>
+            <w:proofErr w:type="spellStart"/>
+            <w:r>
+              <w:rPr>
+                <w:b/>
+                <w:sz w:val="40"/>
+              </w:rPr>
+              <w:t>ro</w:t>
+            </w:r>
+            <w:proofErr w:type="spellEnd"/>
+            <w:r>
+              <w:rPr>
+                <w:b/>
+                <w:sz w:val="40"/>
+              </w:rPr>
+              <w:t>)</w:t>
             </w:r>
           </w:p>
         </w:tc>
@@ -8940,7 +9207,23 @@
                 <w:b/>
                 <w:sz w:val="40"/>
               </w:rPr>
-              <w:t>02(ru)</w:t>
+              <w:t>02(</w:t>
+            </w:r>
+            <w:proofErr w:type="spellStart"/>
+            <w:r>
+              <w:rPr>
+                <w:b/>
+                <w:sz w:val="40"/>
+              </w:rPr>
+              <w:t>ru</w:t>
+            </w:r>
+            <w:proofErr w:type="spellEnd"/>
+            <w:r>
+              <w:rPr>
+                <w:b/>
+                <w:sz w:val="40"/>
+              </w:rPr>
+              <w:t>)</w:t>
             </w:r>
           </w:p>
         </w:tc>
@@ -8972,6 +9255,7 @@
                 <w:lang w:val="ro-RO"/>
               </w:rPr>
             </w:pPr>
+            <w:proofErr w:type="spellStart"/>
             <w:r>
               <w:rPr>
                 <w:b/>
@@ -8979,6 +9263,7 @@
               </w:rPr>
               <w:t>Luni</w:t>
             </w:r>
+            <w:proofErr w:type="spellEnd"/>
           </w:p>
         </w:tc>
         <w:tc>
@@ -10061,6 +10346,7 @@
                 <w:szCs w:val="24"/>
               </w:rPr>
             </w:pPr>
+            <w:proofErr w:type="spellStart"/>
             <w:r>
               <w:rPr>
                 <w:spacing w:val="40"/>
@@ -10083,14 +10369,41 @@
                 <w:sz w:val="24"/>
                 <w:szCs w:val="24"/>
               </w:rPr>
-              <w:t xml:space="preserve">ca   discretă </w:t>
-            </w:r>
+              <w:t>ca</w:t>
+            </w:r>
+            <w:proofErr w:type="spellEnd"/>
             <w:r>
               <w:rPr>
                 <w:spacing w:val="40"/>
                 <w:sz w:val="24"/>
                 <w:szCs w:val="24"/>
               </w:rPr>
+              <w:t xml:space="preserve">   </w:t>
+            </w:r>
+            <w:proofErr w:type="spellStart"/>
+            <w:r>
+              <w:rPr>
+                <w:spacing w:val="40"/>
+                <w:sz w:val="24"/>
+                <w:szCs w:val="24"/>
+              </w:rPr>
+              <w:t>discretă</w:t>
+            </w:r>
+            <w:proofErr w:type="spellEnd"/>
+            <w:r>
+              <w:rPr>
+                <w:spacing w:val="40"/>
+                <w:sz w:val="24"/>
+                <w:szCs w:val="24"/>
+              </w:rPr>
+              <w:t xml:space="preserve"> </w:t>
+            </w:r>
+            <w:r>
+              <w:rPr>
+                <w:spacing w:val="40"/>
+                <w:sz w:val="24"/>
+                <w:szCs w:val="24"/>
+              </w:rPr>
               <w:t>(AG)</w:t>
             </w:r>
             <w:r>
@@ -10127,13 +10440,25 @@
                 <w:lang w:val="it-IT"/>
               </w:rPr>
             </w:pPr>
+            <w:proofErr w:type="spellStart"/>
+            <w:proofErr w:type="gramStart"/>
             <w:r>
               <w:rPr>
                 <w:spacing w:val="40"/>
                 <w:sz w:val="24"/>
                 <w:szCs w:val="24"/>
               </w:rPr>
-              <w:t>A.Niculiță   213a/4</w:t>
+              <w:t>A.Niculiță</w:t>
+            </w:r>
+            <w:proofErr w:type="spellEnd"/>
+            <w:proofErr w:type="gramEnd"/>
+            <w:r>
+              <w:rPr>
+                <w:spacing w:val="40"/>
+                <w:sz w:val="24"/>
+                <w:szCs w:val="24"/>
+              </w:rPr>
+              <w:t xml:space="preserve">   213a/4</w:t>
             </w:r>
           </w:p>
         </w:tc>
@@ -11350,6 +11675,7 @@
                 <w:sz w:val="40"/>
               </w:rPr>
             </w:pPr>
+            <w:proofErr w:type="spellStart"/>
             <w:r>
               <w:rPr>
                 <w:b/>
@@ -11357,6 +11683,7 @@
               </w:rPr>
               <w:t>Marţi</w:t>
             </w:r>
+            <w:proofErr w:type="spellEnd"/>
           </w:p>
         </w:tc>
         <w:tc>
@@ -16462,54 +16789,104 @@
                 <w:szCs w:val="36"/>
               </w:rPr>
             </w:pPr>
+            <w:proofErr w:type="spellStart"/>
             <w:r>
               <w:rPr>
                 <w:spacing w:val="40"/>
                 <w:sz w:val="36"/>
                 <w:szCs w:val="36"/>
               </w:rPr>
-              <w:t xml:space="preserve">Programare </w:t>
-            </w:r>
+              <w:t>Programare</w:t>
+            </w:r>
+            <w:proofErr w:type="spellEnd"/>
             <w:r>
               <w:rPr>
                 <w:spacing w:val="40"/>
                 <w:sz w:val="36"/>
                 <w:szCs w:val="36"/>
               </w:rPr>
-              <w:t>î</w:t>
-            </w:r>
+              <w:t xml:space="preserve"> </w:t>
+            </w:r>
+            <w:proofErr w:type="spellStart"/>
             <w:r>
               <w:rPr>
                 <w:spacing w:val="40"/>
                 <w:sz w:val="36"/>
                 <w:szCs w:val="36"/>
               </w:rPr>
-              <w:t>n Python  (curs)</w:t>
-            </w:r>
-          </w:p>
-          <w:p>
-            <w:pPr>
-              <w:ind w:left="-113" w:right="-113"/>
-              <w:jc w:val="center"/>
-              <w:rPr>
-                <w:sz w:val="24"/>
-                <w:szCs w:val="24"/>
-              </w:rPr>
-            </w:pPr>
+              <w:t>î</w:t>
+            </w:r>
             <w:r>
               <w:rPr>
                 <w:spacing w:val="40"/>
                 <w:sz w:val="36"/>
                 <w:szCs w:val="36"/>
               </w:rPr>
-              <w:t xml:space="preserve">N.Pleșca  </w:t>
-            </w:r>
+              <w:t>n</w:t>
+            </w:r>
+            <w:proofErr w:type="spellEnd"/>
             <w:r>
               <w:rPr>
                 <w:spacing w:val="40"/>
                 <w:sz w:val="36"/>
                 <w:szCs w:val="36"/>
               </w:rPr>
+              <w:t xml:space="preserve"> </w:t>
+            </w:r>
+            <w:proofErr w:type="gramStart"/>
+            <w:r>
+              <w:rPr>
+                <w:spacing w:val="40"/>
+                <w:sz w:val="36"/>
+                <w:szCs w:val="36"/>
+              </w:rPr>
+              <w:t>Python  (</w:t>
+            </w:r>
+            <w:proofErr w:type="gramEnd"/>
+            <w:r>
+              <w:rPr>
+                <w:spacing w:val="40"/>
+                <w:sz w:val="36"/>
+                <w:szCs w:val="36"/>
+              </w:rPr>
+              <w:t>curs)</w:t>
+            </w:r>
+          </w:p>
+          <w:p>
+            <w:pPr>
+              <w:ind w:left="-113" w:right="-113"/>
+              <w:jc w:val="center"/>
+              <w:rPr>
+                <w:sz w:val="24"/>
+                <w:szCs w:val="24"/>
+              </w:rPr>
+            </w:pPr>
+            <w:proofErr w:type="spellStart"/>
+            <w:proofErr w:type="gramStart"/>
+            <w:r>
+              <w:rPr>
+                <w:spacing w:val="40"/>
+                <w:sz w:val="36"/>
+                <w:szCs w:val="36"/>
+              </w:rPr>
+              <w:t>N.Pleșca</w:t>
+            </w:r>
+            <w:proofErr w:type="spellEnd"/>
+            <w:proofErr w:type="gramEnd"/>
+            <w:r>
+              <w:rPr>
+                <w:spacing w:val="40"/>
+                <w:sz w:val="36"/>
+                <w:szCs w:val="36"/>
+              </w:rPr>
+              <w:t xml:space="preserve">  </w:t>
+            </w:r>
+            <w:r>
+              <w:rPr>
+                <w:spacing w:val="40"/>
+                <w:sz w:val="36"/>
+                <w:szCs w:val="36"/>
+              </w:rPr>
               <w:t>213a/4</w:t>
             </w:r>
           </w:p>
@@ -16580,6 +16957,8 @@
               </w:rPr>
               <w:t xml:space="preserve"> </w:t>
             </w:r>
+            <w:proofErr w:type="spellStart"/>
+            <w:proofErr w:type="gramStart"/>
             <w:r>
               <w:rPr>
                 <w:sz w:val="24"/>
@@ -16587,6 +16966,8 @@
               </w:rPr>
               <w:t>G.Marin</w:t>
             </w:r>
+            <w:proofErr w:type="spellEnd"/>
+            <w:proofErr w:type="gramEnd"/>
             <w:r>
               <w:rPr>
                 <w:sz w:val="24"/>
@@ -16651,6 +17032,8 @@
               </w:rPr>
               <w:t xml:space="preserve"> </w:t>
             </w:r>
+            <w:proofErr w:type="spellStart"/>
+            <w:proofErr w:type="gramStart"/>
             <w:r>
               <w:rPr>
                 <w:sz w:val="24"/>
@@ -16670,7 +17053,16 @@
                 <w:sz w:val="24"/>
                 <w:szCs w:val="24"/>
               </w:rPr>
-              <w:t>chiopu  251/4</w:t>
+              <w:t>chiopu</w:t>
+            </w:r>
+            <w:proofErr w:type="spellEnd"/>
+            <w:proofErr w:type="gramEnd"/>
+            <w:r>
+              <w:rPr>
+                <w:sz w:val="24"/>
+                <w:szCs w:val="24"/>
+              </w:rPr>
+              <w:t xml:space="preserve">  251/4</w:t>
             </w:r>
           </w:p>
         </w:tc>
@@ -16848,6 +17240,7 @@
             <w:r>
               <w:t xml:space="preserve"> </w:t>
             </w:r>
+            <w:proofErr w:type="gramStart"/>
             <w:r>
               <w:t>O</w:t>
             </w:r>
@@ -16855,7 +17248,14 @@
               <w:rPr>
                 <w:lang w:val="it-IT"/>
               </w:rPr>
-              <w:t>pț.psihol.(curs,</w:t>
+              <w:t>pț.psihol.(</w:t>
+            </w:r>
+            <w:proofErr w:type="gramEnd"/>
+            <w:r>
+              <w:rPr>
+                <w:lang w:val="it-IT"/>
+              </w:rPr>
+              <w:t>curs,</w:t>
             </w:r>
             <w:r>
               <w:rPr>
@@ -16869,6 +17269,12 @@
                 <w:lang w:val="it-IT"/>
               </w:rPr>
               <w:t>)</w:t>
+            </w:r>
+            <w:r>
+              <w:rPr>
+                <w:lang w:val="it-IT"/>
+              </w:rPr>
+              <w:t>,</w:t>
             </w:r>
           </w:p>
           <w:p>
@@ -18177,6 +18583,8 @@
                 <w:szCs w:val="28"/>
               </w:rPr>
             </w:pPr>
+            <w:proofErr w:type="spellStart"/>
+            <w:proofErr w:type="gramStart"/>
             <w:r>
               <w:rPr>
                 <w:sz w:val="28"/>
@@ -18196,7 +18604,16 @@
                 <w:sz w:val="28"/>
                 <w:szCs w:val="28"/>
               </w:rPr>
-              <w:t>chiopu  401/4</w:t>
+              <w:t>chiopu</w:t>
+            </w:r>
+            <w:proofErr w:type="spellEnd"/>
+            <w:proofErr w:type="gramEnd"/>
+            <w:r>
+              <w:rPr>
+                <w:sz w:val="28"/>
+                <w:szCs w:val="28"/>
+              </w:rPr>
+              <w:t xml:space="preserve">  401/4</w:t>
             </w:r>
           </w:p>
         </w:tc>
@@ -18835,12 +19252,23 @@
                 <w:szCs w:val="24"/>
               </w:rPr>
             </w:pPr>
-            <w:r>
-              <w:rPr>
-                <w:sz w:val="28"/>
-                <w:szCs w:val="28"/>
-              </w:rPr>
-              <w:t>N.Pleșca   213a/4</w:t>
+            <w:proofErr w:type="spellStart"/>
+            <w:proofErr w:type="gramStart"/>
+            <w:r>
+              <w:rPr>
+                <w:sz w:val="28"/>
+                <w:szCs w:val="28"/>
+              </w:rPr>
+              <w:t>N.Pleșca</w:t>
+            </w:r>
+            <w:proofErr w:type="spellEnd"/>
+            <w:proofErr w:type="gramEnd"/>
+            <w:r>
+              <w:rPr>
+                <w:sz w:val="28"/>
+                <w:szCs w:val="28"/>
+              </w:rPr>
+              <w:t xml:space="preserve">   213a/4</w:t>
             </w:r>
           </w:p>
         </w:tc>
@@ -19258,6 +19686,7 @@
                 <w:sz w:val="40"/>
               </w:rPr>
             </w:pPr>
+            <w:proofErr w:type="spellStart"/>
             <w:r>
               <w:rPr>
                 <w:b/>
@@ -19265,6 +19694,7 @@
               </w:rPr>
               <w:t>Vineri</w:t>
             </w:r>
+            <w:proofErr w:type="spellEnd"/>
           </w:p>
         </w:tc>
         <w:tc>
@@ -19740,6 +20170,7 @@
                 <w:szCs w:val="28"/>
               </w:rPr>
             </w:pPr>
+            <w:proofErr w:type="spellStart"/>
             <w:r>
               <w:rPr>
                 <w:sz w:val="28"/>
@@ -19747,6 +20178,7 @@
               </w:rPr>
               <w:t>Filozofie</w:t>
             </w:r>
+            <w:proofErr w:type="spellEnd"/>
             <w:r>
               <w:rPr>
                 <w:sz w:val="28"/>
@@ -19759,24 +20191,51 @@
                 <w:sz w:val="28"/>
                 <w:szCs w:val="28"/>
               </w:rPr>
-              <w:t>(sem)</w:t>
-            </w:r>
-          </w:p>
-          <w:p>
-            <w:pPr>
-              <w:jc w:val="center"/>
-              <w:rPr>
-                <w:sz w:val="24"/>
-                <w:szCs w:val="24"/>
-                <w:lang w:val="it-IT"/>
-              </w:rPr>
-            </w:pPr>
-            <w:r>
-              <w:rPr>
-                <w:sz w:val="28"/>
-                <w:szCs w:val="28"/>
-              </w:rPr>
-              <w:t>R.Belogorodov  401/4</w:t>
+              <w:t>(</w:t>
+            </w:r>
+            <w:proofErr w:type="spellStart"/>
+            <w:r>
+              <w:rPr>
+                <w:sz w:val="28"/>
+                <w:szCs w:val="28"/>
+              </w:rPr>
+              <w:t>sem</w:t>
+            </w:r>
+            <w:proofErr w:type="spellEnd"/>
+            <w:r>
+              <w:rPr>
+                <w:sz w:val="28"/>
+                <w:szCs w:val="28"/>
+              </w:rPr>
+              <w:t>)</w:t>
+            </w:r>
+          </w:p>
+          <w:p>
+            <w:pPr>
+              <w:jc w:val="center"/>
+              <w:rPr>
+                <w:sz w:val="24"/>
+                <w:szCs w:val="24"/>
+                <w:lang w:val="it-IT"/>
+              </w:rPr>
+            </w:pPr>
+            <w:proofErr w:type="spellStart"/>
+            <w:proofErr w:type="gramStart"/>
+            <w:r>
+              <w:rPr>
+                <w:sz w:val="28"/>
+                <w:szCs w:val="28"/>
+              </w:rPr>
+              <w:t>R.Belogorodov</w:t>
+            </w:r>
+            <w:proofErr w:type="spellEnd"/>
+            <w:proofErr w:type="gramEnd"/>
+            <w:r>
+              <w:rPr>
+                <w:sz w:val="28"/>
+                <w:szCs w:val="28"/>
+              </w:rPr>
+              <w:t xml:space="preserve">  401/4</w:t>
             </w:r>
           </w:p>
         </w:tc>
@@ -19844,6 +20303,7 @@
                 <w:szCs w:val="28"/>
               </w:rPr>
             </w:pPr>
+            <w:proofErr w:type="spellStart"/>
             <w:r>
               <w:rPr>
                 <w:sz w:val="28"/>
@@ -19851,6 +20311,7 @@
               </w:rPr>
               <w:t>Filozofie</w:t>
             </w:r>
+            <w:proofErr w:type="spellEnd"/>
             <w:r>
               <w:rPr>
                 <w:sz w:val="28"/>
@@ -19863,24 +20324,51 @@
                 <w:sz w:val="28"/>
                 <w:szCs w:val="28"/>
               </w:rPr>
-              <w:t>(sem)</w:t>
-            </w:r>
-          </w:p>
-          <w:p>
-            <w:pPr>
-              <w:jc w:val="center"/>
-              <w:rPr>
-                <w:sz w:val="24"/>
-                <w:szCs w:val="24"/>
-                <w:lang w:val="it-IT"/>
-              </w:rPr>
-            </w:pPr>
-            <w:r>
-              <w:rPr>
-                <w:sz w:val="28"/>
-                <w:szCs w:val="28"/>
-              </w:rPr>
-              <w:t>R.Belogorodov  401/4</w:t>
+              <w:t>(</w:t>
+            </w:r>
+            <w:proofErr w:type="spellStart"/>
+            <w:r>
+              <w:rPr>
+                <w:sz w:val="28"/>
+                <w:szCs w:val="28"/>
+              </w:rPr>
+              <w:t>sem</w:t>
+            </w:r>
+            <w:proofErr w:type="spellEnd"/>
+            <w:r>
+              <w:rPr>
+                <w:sz w:val="28"/>
+                <w:szCs w:val="28"/>
+              </w:rPr>
+              <w:t>)</w:t>
+            </w:r>
+          </w:p>
+          <w:p>
+            <w:pPr>
+              <w:jc w:val="center"/>
+              <w:rPr>
+                <w:sz w:val="24"/>
+                <w:szCs w:val="24"/>
+                <w:lang w:val="it-IT"/>
+              </w:rPr>
+            </w:pPr>
+            <w:proofErr w:type="spellStart"/>
+            <w:proofErr w:type="gramStart"/>
+            <w:r>
+              <w:rPr>
+                <w:sz w:val="28"/>
+                <w:szCs w:val="28"/>
+              </w:rPr>
+              <w:t>R.Belogorodov</w:t>
+            </w:r>
+            <w:proofErr w:type="spellEnd"/>
+            <w:proofErr w:type="gramEnd"/>
+            <w:r>
+              <w:rPr>
+                <w:sz w:val="28"/>
+                <w:szCs w:val="28"/>
+              </w:rPr>
+              <w:t xml:space="preserve">  401/4</w:t>
             </w:r>
           </w:p>
         </w:tc>
@@ -19933,12 +20421,23 @@
                 <w:lang w:val="it-IT"/>
               </w:rPr>
             </w:pPr>
-            <w:r>
-              <w:rPr>
-                <w:sz w:val="28"/>
-                <w:szCs w:val="28"/>
-              </w:rPr>
-              <w:t>N.Pleșca  404/4</w:t>
+            <w:proofErr w:type="spellStart"/>
+            <w:proofErr w:type="gramStart"/>
+            <w:r>
+              <w:rPr>
+                <w:sz w:val="28"/>
+                <w:szCs w:val="28"/>
+              </w:rPr>
+              <w:t>N.Pleșca</w:t>
+            </w:r>
+            <w:proofErr w:type="spellEnd"/>
+            <w:proofErr w:type="gramEnd"/>
+            <w:r>
+              <w:rPr>
+                <w:sz w:val="28"/>
+                <w:szCs w:val="28"/>
+              </w:rPr>
+              <w:t xml:space="preserve">  404/4</w:t>
             </w:r>
           </w:p>
         </w:tc>
@@ -20329,6 +20828,7 @@
                 <w:szCs w:val="28"/>
               </w:rPr>
             </w:pPr>
+            <w:proofErr w:type="spellStart"/>
             <w:r>
               <w:rPr>
                 <w:sz w:val="28"/>
@@ -20336,6 +20836,7 @@
               </w:rPr>
               <w:t>Filozofie</w:t>
             </w:r>
+            <w:proofErr w:type="spellEnd"/>
             <w:r>
               <w:rPr>
                 <w:sz w:val="28"/>
@@ -20348,24 +20849,51 @@
                 <w:sz w:val="28"/>
                 <w:szCs w:val="28"/>
               </w:rPr>
-              <w:t>(sem)</w:t>
-            </w:r>
-          </w:p>
-          <w:p>
-            <w:pPr>
-              <w:jc w:val="center"/>
-              <w:rPr>
-                <w:sz w:val="24"/>
-                <w:szCs w:val="24"/>
-                <w:lang w:val="it-IT"/>
-              </w:rPr>
-            </w:pPr>
-            <w:r>
-              <w:rPr>
-                <w:sz w:val="28"/>
-                <w:szCs w:val="28"/>
-              </w:rPr>
-              <w:t>R.Belogorodov  401/4</w:t>
+              <w:t>(</w:t>
+            </w:r>
+            <w:proofErr w:type="spellStart"/>
+            <w:r>
+              <w:rPr>
+                <w:sz w:val="28"/>
+                <w:szCs w:val="28"/>
+              </w:rPr>
+              <w:t>sem</w:t>
+            </w:r>
+            <w:proofErr w:type="spellEnd"/>
+            <w:r>
+              <w:rPr>
+                <w:sz w:val="28"/>
+                <w:szCs w:val="28"/>
+              </w:rPr>
+              <w:t>)</w:t>
+            </w:r>
+          </w:p>
+          <w:p>
+            <w:pPr>
+              <w:jc w:val="center"/>
+              <w:rPr>
+                <w:sz w:val="24"/>
+                <w:szCs w:val="24"/>
+                <w:lang w:val="it-IT"/>
+              </w:rPr>
+            </w:pPr>
+            <w:proofErr w:type="spellStart"/>
+            <w:proofErr w:type="gramStart"/>
+            <w:r>
+              <w:rPr>
+                <w:sz w:val="28"/>
+                <w:szCs w:val="28"/>
+              </w:rPr>
+              <w:t>R.Belogorodov</w:t>
+            </w:r>
+            <w:proofErr w:type="spellEnd"/>
+            <w:proofErr w:type="gramEnd"/>
+            <w:r>
+              <w:rPr>
+                <w:sz w:val="28"/>
+                <w:szCs w:val="28"/>
+              </w:rPr>
+              <w:t xml:space="preserve">  401/4</w:t>
             </w:r>
           </w:p>
         </w:tc>
@@ -21138,6 +21666,7 @@
                 <w:sz w:val="40"/>
               </w:rPr>
             </w:pPr>
+            <w:proofErr w:type="spellStart"/>
             <w:r>
               <w:rPr>
                 <w:b/>
@@ -21145,6 +21674,7 @@
               </w:rPr>
               <w:t>Sâmbătă</w:t>
             </w:r>
+            <w:proofErr w:type="spellEnd"/>
           </w:p>
         </w:tc>
         <w:tc>
@@ -21319,6 +21849,8 @@
               </w:rPr>
               <w:t xml:space="preserve"> </w:t>
             </w:r>
+            <w:proofErr w:type="spellStart"/>
+            <w:proofErr w:type="gramStart"/>
             <w:r>
               <w:rPr>
                 <w:sz w:val="24"/>
@@ -21338,7 +21870,16 @@
                 <w:sz w:val="24"/>
                 <w:szCs w:val="24"/>
               </w:rPr>
-              <w:t>chiopu  251/4</w:t>
+              <w:t>chiopu</w:t>
+            </w:r>
+            <w:proofErr w:type="spellEnd"/>
+            <w:proofErr w:type="gramEnd"/>
+            <w:r>
+              <w:rPr>
+                <w:sz w:val="24"/>
+                <w:szCs w:val="24"/>
+              </w:rPr>
+              <w:t xml:space="preserve">  251/4</w:t>
             </w:r>
           </w:p>
           <w:p>

</xml_diff>